<commit_message>
docs(irb): remove swivel-chair references; keep vaguer seated wording
Drop "swivel chair" across source docs, the generated packet, and the
filled HRP-502 consent (keeping "seated" and objects arranged around the
participant); update verify keyword checks to match.

Co-Authored-By: Claude Opus 4.8 <noreply@anthropic.com>
</commit_message>
<xml_diff>
--- a/docs/irb/submission/HRP-502_Gaze_Contingency_Adult_Consent_DRAFT.docx
+++ b/docs/irb/submission/HRP-502_Gaze_Contingency_Adult_Consent_DRAFT.docx
@@ -188,7 +188,7 @@
           <w:rFonts w:ascii="Arial" w:hAnsi="Arial"/>
           <w:b w:val="0"/>
         </w:rPr>
-        <w:t>. While seated in a swivel chair, you will wear an HTC Vive Focus Vision headset and turn to search for virtual colored shapes arranged around you. You will complete practice followed by four search blocks with up to 16 trials each (up to 64 experimental trials total), receive spoken hints, answer questionnaires, and provide about 1–2 minutes of your own speech. Your session may contain fewer trials if you stop, experience discomfort, encounter a technical problem, or reach the visit-time limit. Offline software on a UCF-managed research computer will use that recording to make a private synthetic voice that resembles you and can say study phrases you did not record. Your recording and synthetic voice will not be sent to an outside voice service.</w:t>
+        <w:t>. While seated, you will wear an HTC Vive Focus Vision headset and turn to search for virtual colored shapes arranged around you. You will complete practice followed by four search blocks with up to 16 trials each (up to 64 experimental trials total), receive spoken hints, answer questionnaires, and provide about 1–2 minutes of your own speech. Your session may contain fewer trials if you stop, experience discomfort, encounter a technical problem, or reach the visit-time limit. Offline software on a UCF-managed research computer will use that recording to make a private synthetic voice that resembles you and can say study phrases you did not record. Your recording and synthetic voice will not be sent to an outside voice service.</w:t>
       </w:r>
     </w:p>
     <w:p>
@@ -565,7 +565,7 @@
           <w:rFonts w:ascii="Arial" w:hAnsi="Arial"/>
           <w:b w:val="0"/>
         </w:rPr>
-        <w:t>5. Seat you in a swivel chair at a marked position, fit and calibrate the HTC Vive Focus Vision headset, and check that you can comfortably turn to view the search area around you. The headset uses cameras to show your surroundings and eye tracking to estimate where you look. The study application does not save room video, face video, webcam video, or raw eye-camera images.</w:t>
+        <w:t>5. Seat you at a marked position, fit and calibrate the HTC Vive Focus Vision headset, and check that you can comfortably turn to view the search area around you. The headset uses cameras to show your surroundings and eye tracking to estimate where you look. The study application does not save room video, face video, webcam video, or raw eye-camera images.</w:t>
       </w:r>
     </w:p>
     <w:p>

</xml_diff>